<commit_message>
Code and data on Zenodo only (ASE does not accept .zip): update S11, cover letter and Data availability
Co-Authored-By: Claude Opus 5.5 <noreply@anthropic.com>
Claude-Session: https://claude.ai/code/session_01MSqiFEviRg6WLXKJLTnixZ
</commit_message>
<xml_diff>
--- a/manuscript/ase/word/Supplementary_Material_ASE.docx
+++ b/manuscript/ase/word/Supplementary_Material_ASE.docx
@@ -27298,22 +27298,7 @@
         <w:pStyle w:val="FirstParagraph"/>
       </w:pPr>
       <w:r>
-        <w:t xml:space="preserve">The archive</w:t>
-      </w:r>
-      <w:r>
-        <w:t xml:space="preserve"> </w:t>
-      </w:r>
-      <w:r>
-        <w:rPr>
-          <w:rStyle w:val="VerbatimChar"/>
-        </w:rPr>
-        <w:t xml:space="preserve">scripts.zip</w:t>
-      </w:r>
-      <w:r>
-        <w:t xml:space="preserve"> </w:t>
-      </w:r>
-      <w:r>
-        <w:t xml:space="preserve">contains the analysis scripts and the console output of every run.</w:t>
+        <w:t xml:space="preserve">The code and data archive on Zenodo (https://doi.org/10.5281/zenodo.23535533, CC BY 4.0) contains the analysis scripts and the console output of every run.</w:t>
       </w:r>
       <w:r>
         <w:t xml:space="preserve"> </w:t>

</xml_diff>